<commit_message>
@tech-report: Filled DNV Proposal WEB Aruba with full content via track changes (PROP-003-WEBaruba)
</commit_message>
<xml_diff>
--- a/projects/PROJ-001-Croon-Wolter-Simonshaven-EMC/Meetings/Project Tracker DNV - Simonshaven 380kV - Expansion DP2-4 EMC.docx
+++ b/projects/PROJ-001-Croon-Wolter-Simonshaven-EMC/Meetings/Project Tracker DNV - Simonshaven 380kV - Expansion DP2-4 EMC.docx
@@ -2893,12 +2893,12 @@
               <w:rPr>
                 <w:b/>
                 <w:bCs/>
-                <w:color w:val="F79646" w:themeColor="accent6"/>
+                <w:color w:val="00B050"/>
                 <w:sz w:val="22"/>
                 <w:szCs w:val="22"/>
                 <w:lang w:val="nl-NL"/>
               </w:rPr>
-              <w:t>OPEN</w:t>
+              <w:t>CLOSED</w:t>
             </w:r>
           </w:p>
         </w:tc>

</xml_diff>